<commit_message>
docs: use direct method names in optimization explanation
</commit_message>
<xml_diff>
--- a/资料/实验报告/现有优化主线_数学描述与流程_20261008_公式排版.docx
+++ b/资料/实验报告/现有优化主线_数学描述与流程_20261008_公式排版.docx
@@ -264,7 +264,7 @@
                 <w:sz w:val="22"/>
                 <w:szCs w:val="21"/>
               </w:rPr>
-              <w:t>全片共享体型</w:t>
+              <w:t>整个序列共享体型</w:t>
             </w:r>
           </w:p>
         </w:tc>
@@ -618,7 +618,7 @@
                 <w:szCs w:val="21"/>
                 <w:lang w:eastAsia="zh-CN"/>
               </w:rPr>
-              <w:t>每只手全片共享PCA系数</w:t>
+              <w:t>每只手整个序列共享PCA系数</w:t>
             </w:r>
           </w:p>
         </w:tc>
@@ -664,7 +664,7 @@
           <w:sz w:val="24"/>
           <w:lang w:eastAsia="zh-CN"/>
         </w:rPr>
-        <w:t>解码为21个身体关节的轴角。SMPL-H据此生成6890个顶点，固定COCO回归矩阵从表面得到17个模型观察点：</w:t>
+        <w:t>解码为21个身体关节的轴角。SMPL-H据此生成6890个顶点，固定COCO回归矩阵从表面得到17个模型关键点：</w:t>
       </w:r>
     </w:p>
     <w:p>
@@ -1481,7 +1481,7 @@
           <w:sz w:val="24"/>
           <w:lang w:eastAsia="zh-CN"/>
         </w:rPr>
-        <w:t>要求原图内、数值有限、两侧正深度及非平行射线。身体拟合使用连续加权的三维候选，地面位姿估计使用严格双目点。</w:t>
+        <w:t>要求原图内、数值有限、两侧正深度及非平行射线。身体拟合使用连续加权的三维候选，地面位姿估计使用通过严格筛选的双目三维点。</w:t>
       </w:r>
     </w:p>
     <w:p>
@@ -2104,7 +2104,7 @@
           <w:sz w:val="24"/>
           <w:lang w:eastAsia="zh-CN"/>
         </w:rPr>
-        <w:t>回投影误差在25px以内、射线间距在80mm以内时，保留置信度给出的权重；超过后按四次尾部连续衰减。</w:t>
+        <w:t>回投影误差在25px以内、射线间距在80mm以内时，保留置信度给出的权重；超过后按四次幂函数连续降低权重。</w:t>
       </w:r>
     </w:p>
     <w:p>
@@ -2149,7 +2149,7 @@
           <w:sz w:val="26"/>
           <w:lang w:eastAsia="zh-CN"/>
         </w:rPr>
-        <w:t>3. 身体目标</w:t>
+        <w:t>3. 身体拟合损失</w:t>
       </w:r>
     </w:p>
     <w:p>
@@ -2216,7 +2216,7 @@
           <w:sz w:val="24"/>
           <w:lang w:eastAsia="zh-CN"/>
         </w:rPr>
-        <w:t>均为m。身体数据项为全片加权平方残差：</w:t>
+        <w:t>均为m。身体数据项为整个序列加权平方残差：</w:t>
       </w:r>
     </w:p>
     <w:p>
@@ -3237,7 +3237,7 @@
         <w:rPr>
           <w:sz w:val="24"/>
         </w:rPr>
-        <w:t>依次为姿态、体型、根方向正则，</w:t>
+        <w:t>依次为姿态、体型、根旋转正则，</w:t>
       </w:r>
       <m:oMath>
         <m:sSubSup>
@@ -3612,7 +3612,7 @@
           <w:sz w:val="24"/>
           <w:lang w:eastAsia="zh-CN"/>
         </w:rPr>
-        <w:t>与初值的平方差计算。位置与姿态拟合、体型拟合使用式(7)，身体联合拟合在此基础上加入</w:t>
+        <w:t>与初值的平方差计算。位置与姿态拟合、体型拟合使用式(7)，身体参数联合拟合在此基础上加入</w:t>
       </w:r>
       <w:proofErr w:type="gramStart"/>
       <w:r>
@@ -3665,7 +3665,7 @@
           <w:sz w:val="26"/>
           <w:lang w:eastAsia="zh-CN"/>
         </w:rPr>
-        <w:t>4. 冷启动</w:t>
+        <w:t>4. 参数初始化</w:t>
       </w:r>
     </w:p>
     <w:p>
@@ -4459,7 +4459,7 @@
           <w:sz w:val="24"/>
           <w:lang w:eastAsia="zh-CN"/>
         </w:rPr>
-        <w:t>局部旋转投影到PCA空间，按全片观测权重平均，得到共享手姿初值。</w:t>
+        <w:t>局部旋转投影到PCA空间，按整个序列观测权重平均，得到共享手姿初值。</w:t>
       </w:r>
     </w:p>
     <w:p>
@@ -4477,7 +4477,7 @@
           <w:sz w:val="26"/>
           <w:lang w:eastAsia="zh-CN"/>
         </w:rPr>
-        <w:t>5. 局部手姿目标</w:t>
+        <w:t>5. 手部姿态拟合损失</w:t>
       </w:r>
     </w:p>
     <w:p>
@@ -6395,7 +6395,7 @@
                 <w:rFonts w:ascii="宋体" w:hAnsi="宋体"/>
                 <w:sz w:val="22"/>
               </w:rPr>
-              <w:t>身体联合</w:t>
+              <w:t>身体参数联合拟合</w:t>
             </w:r>
           </w:p>
         </w:tc>
@@ -6543,7 +6543,7 @@
                 <w:rFonts w:ascii="宋体" w:hAnsi="宋体"/>
                 <w:sz w:val="22"/>
               </w:rPr>
-              <w:t>手姿初拟合</w:t>
+              <w:t>手部姿态拟合</w:t>
             </w:r>
           </w:p>
         </w:tc>
@@ -6656,7 +6656,7 @@
                 <w:rFonts w:ascii="宋体" w:hAnsi="宋体"/>
                 <w:sz w:val="22"/>
               </w:rPr>
-              <w:t>手姿细化</w:t>
+              <w:t>手部姿态进一步拟合</w:t>
             </w:r>
           </w:p>
         </w:tc>
@@ -7550,7 +7550,7 @@
           <w:sz w:val="24"/>
           <w:lang w:eastAsia="zh-CN"/>
         </w:rPr>
-        <w:t>时，保持相机地面位姿并更新踝锚；助</w:t>
+        <w:t>时，保持相机地面位姿并更新踝关节参考位置；助</w:t>
       </w:r>
       <w:proofErr w:type="gramStart"/>
       <w:r>
@@ -7568,7 +7568,7 @@
           <w:sz w:val="24"/>
           <w:lang w:eastAsia="zh-CN"/>
         </w:rPr>
-        <w:t>时，由背景估计相机旋转，再结合严格踝点求平移。设A</w:t>
+        <w:t>时，由背景估计相机旋转，再结合通过严格筛选的踝关节三维点求平移。设A</w:t>
       </w:r>
       <w:r>
         <w:rPr>
@@ -7584,7 +7584,7 @@
           <w:sz w:val="24"/>
           <w:lang w:eastAsia="zh-CN"/>
         </w:rPr>
-        <w:t>为地面系踝锚、p</w:t>
+        <w:t>为地面系踝关节参考位置、p</w:t>
       </w:r>
       <w:r>
         <w:rPr>
@@ -8042,7 +8042,7 @@
           <w:sz w:val="24"/>
           <w:lang w:eastAsia="zh-CN"/>
         </w:rPr>
-        <w:t>双踝推算的平移差≤60mm时取均值，接受的平移以0.45增益更新；基本平移步长门120mm，旋转步长门5°。完成场景位姿估计后，将人体、助步器和相机按同一帧的R/t转换到地面坐标系。</w:t>
+        <w:t>双踝推算的平移差≤60mm时取均值，接受的平移以0.45增益更新；单次平移更新阈值为120mm，旋转步长门5°。完成场景位姿估计后，将人体、助步器和相机按同一帧的R/t转换到地面坐标系。</w:t>
       </w:r>
     </w:p>
     <w:sectPr>

</xml_diff>

<commit_message>
docs: explain staged objective and parameter update logic
</commit_message>
<xml_diff>
--- a/资料/实验报告/现有优化主线_数学描述与流程_20261008_公式排版.docx
+++ b/资料/实验报告/现有优化主线_数学描述与流程_20261008_公式排版.docx
@@ -6762,6 +6762,567 @@
     </w:p>
     <w:p>
       <w:pPr>
+        <w:pageBreakBefore w:val="0"/>
+        <w:spacing w:line="276" w:lineRule="auto" w:before="0" w:after="100"/>
+        <w:rPr>
+          <w:rFonts w:ascii="宋体" w:hAnsi="宋体"/>
+          <w:lang w:eastAsia="zh-CN"/>
+        </w:rPr>
+      </w:pPr>
+      <w:r>
+        <w:rPr>
+          <w:sz w:val="24"/>
+        </w:rPr>
+        <w:t xml:space="preserve">当前阶段待更新参数记为 </w:t>
+      </w:r>
+      <m:oMath>
+        <m:r>
+          <m:t>u</m:t>
+        </m:r>
+      </m:oMath>
+      <w:r>
+        <w:rPr>
+          <w:sz w:val="24"/>
+        </w:rPr>
+        <w:t xml:space="preserve">，固定参数记为 </w:t>
+      </w:r>
+      <m:oMath>
+        <m:sSub>
+          <m:e>
+            <m:r>
+              <m:t>v</m:t>
+            </m:r>
+          </m:e>
+          <m:sub>
+            <m:r>
+              <m:t>0</m:t>
+            </m:r>
+          </m:sub>
+        </m:sSub>
+      </m:oMath>
+      <w:r>
+        <w:rPr>
+          <w:sz w:val="24"/>
+        </w:rPr>
+        <w:t>。两组参数共同生成模型，当前阶段求解：</w:t>
+      </w:r>
+    </w:p>
+    <w:p>
+      <w:pPr>
+        <w:keepNext/>
+        <w:pageBreakBefore w:val="0"/>
+        <w:spacing w:line="276" w:lineRule="auto" w:before="0" w:after="100"/>
+        <w:rPr>
+          <w:rFonts w:ascii="宋体" w:hAnsi="宋体"/>
+          <w:lang w:eastAsia="zh-CN"/>
+        </w:rPr>
+      </w:pPr>
+      <m:oMathPara>
+        <m:oMath>
+          <m:sSub>
+            <m:e>
+              <m:r>
+                <w:rPr>
+                  <w:sz w:val="26"/>
+                </w:rPr>
+                <m:t>min</m:t>
+              </m:r>
+            </m:e>
+            <m:sub>
+              <m:r>
+                <w:rPr>
+                  <w:sz w:val="26"/>
+                </w:rPr>
+                <m:t>u</m:t>
+              </m:r>
+            </m:sub>
+          </m:sSub>
+          <m:r>
+            <w:rPr>
+              <w:sz w:val="26"/>
+            </w:rPr>
+            <m:t xml:space="preserve"> L(</m:t>
+          </m:r>
+          <m:r>
+            <w:rPr>
+              <w:sz w:val="26"/>
+            </w:rPr>
+            <m:t>u</m:t>
+          </m:r>
+          <m:r>
+            <w:rPr>
+              <w:sz w:val="26"/>
+            </w:rPr>
+            <m:t>,</m:t>
+          </m:r>
+          <m:sSub>
+            <m:e>
+              <m:r>
+                <w:rPr>
+                  <w:sz w:val="26"/>
+                </w:rPr>
+                <m:t>v</m:t>
+              </m:r>
+            </m:e>
+            <m:sub>
+              <m:r>
+                <w:rPr>
+                  <w:sz w:val="26"/>
+                </w:rPr>
+                <m:t>0</m:t>
+              </m:r>
+            </m:sub>
+          </m:sSub>
+          <m:r>
+            <w:rPr>
+              <w:sz w:val="26"/>
+            </w:rPr>
+            <m:t>)</m:t>
+          </m:r>
+        </m:oMath>
+      </m:oMathPara>
+    </w:p>
+    <w:p>
+      <w:pPr>
+        <w:pageBreakBefore w:val="0"/>
+        <w:spacing w:line="276" w:lineRule="auto" w:before="0" w:after="100"/>
+        <w:rPr>
+          <w:rFonts w:ascii="宋体" w:hAnsi="宋体"/>
+          <w:lang w:eastAsia="zh-CN"/>
+        </w:rPr>
+      </w:pPr>
+      <w:r>
+        <w:rPr>
+          <w:sz w:val="24"/>
+        </w:rPr>
+        <w:t>每轮先清除上一轮梯度，将姿态编码解码，再由全部当前参数生成网格与关键点。使用有效掩码和观测权重计算拟合误差，加入该阶段的约束项，得到一个总损失。随后反向传播：</w:t>
+      </w:r>
+    </w:p>
+    <w:p>
+      <w:pPr>
+        <w:keepNext/>
+        <w:pageBreakBefore w:val="0"/>
+        <w:spacing w:line="276" w:lineRule="auto" w:before="0" w:after="100"/>
+        <w:rPr>
+          <w:rFonts w:ascii="宋体" w:hAnsi="宋体"/>
+          <w:lang w:eastAsia="zh-CN"/>
+        </w:rPr>
+      </w:pPr>
+      <m:oMathPara>
+        <m:oMath>
+          <m:sSub>
+            <m:e>
+              <m:r>
+                <w:rPr>
+                  <w:sz w:val="26"/>
+                </w:rPr>
+                <m:t>g</m:t>
+              </m:r>
+            </m:e>
+            <m:sub>
+              <m:r>
+                <w:rPr>
+                  <w:sz w:val="26"/>
+                </w:rPr>
+                <m:t>u</m:t>
+              </m:r>
+            </m:sub>
+          </m:sSub>
+          <m:r>
+            <w:rPr>
+              <w:sz w:val="26"/>
+            </w:rPr>
+            <m:t>=</m:t>
+          </m:r>
+          <m:f>
+            <m:num>
+              <m:r>
+                <w:rPr>
+                  <w:sz w:val="26"/>
+                </w:rPr>
+                <m:t>∂</m:t>
+              </m:r>
+              <m:r>
+                <w:rPr>
+                  <w:sz w:val="26"/>
+                </w:rPr>
+                <m:t xml:space="preserve"> L(</m:t>
+              </m:r>
+              <m:r>
+                <w:rPr>
+                  <w:sz w:val="26"/>
+                </w:rPr>
+                <m:t>u</m:t>
+              </m:r>
+              <m:r>
+                <w:rPr>
+                  <w:sz w:val="26"/>
+                </w:rPr>
+                <m:t>,</m:t>
+              </m:r>
+              <m:sSub>
+                <m:e>
+                  <m:r>
+                    <w:rPr>
+                      <w:sz w:val="26"/>
+                    </w:rPr>
+                    <m:t>v</m:t>
+                  </m:r>
+                </m:e>
+                <m:sub>
+                  <m:r>
+                    <w:rPr>
+                      <w:sz w:val="26"/>
+                    </w:rPr>
+                    <m:t>0</m:t>
+                  </m:r>
+                </m:sub>
+              </m:sSub>
+              <m:r>
+                <w:rPr>
+                  <w:sz w:val="26"/>
+                </w:rPr>
+                <m:t>)</m:t>
+              </m:r>
+            </m:num>
+            <m:den>
+              <m:r>
+                <w:rPr>
+                  <w:sz w:val="26"/>
+                </w:rPr>
+                <m:t>∂</m:t>
+              </m:r>
+              <m:r>
+                <w:rPr>
+                  <w:sz w:val="26"/>
+                </w:rPr>
+                <m:t>u</m:t>
+              </m:r>
+            </m:den>
+          </m:f>
+        </m:oMath>
+      </m:oMathPara>
+    </w:p>
+    <w:p>
+      <w:pPr>
+        <w:pageBreakBefore w:val="0"/>
+        <w:spacing w:line="276" w:lineRule="auto" w:before="0" w:after="100"/>
+        <w:rPr>
+          <w:rFonts w:ascii="宋体" w:hAnsi="宋体"/>
+          <w:lang w:eastAsia="zh-CN"/>
+        </w:rPr>
+      </w:pPr>
+      <w:r>
+        <w:rPr>
+          <w:sz w:val="24"/>
+        </w:rPr>
+        <w:t>Adam根据该梯度更新当前阶段参数。更新后的参数用于下一轮模型计算；进入下一阶段时，沿用已有参数值并重新建立Adam。各阶段实际影响更新的目标为：</w:t>
+      </w:r>
+    </w:p>
+    <w:p>
+      <w:pPr>
+        <w:pageBreakBefore w:val="0"/>
+        <w:spacing w:line="276" w:lineRule="auto" w:before="0" w:after="100"/>
+        <w:rPr>
+          <w:rFonts w:ascii="宋体" w:hAnsi="宋体"/>
+          <w:lang w:eastAsia="zh-CN"/>
+        </w:rPr>
+      </w:pPr>
+      <w:r>
+        <w:rPr>
+          <w:sz w:val="24"/>
+        </w:rPr>
+        <w:t>位置与姿态：</w:t>
+      </w:r>
+      <m:oMath>
+        <m:sSub>
+          <m:e>
+            <m:r>
+              <m:t>L</m:t>
+            </m:r>
+          </m:e>
+          <m:sub>
+            <m:r>
+              <m:t>3D</m:t>
+            </m:r>
+          </m:sub>
+        </m:sSub>
+        <m:sSub>
+          <m:e>
+            <m:r>
+              <m:t>+0.02L</m:t>
+            </m:r>
+          </m:e>
+          <m:sub>
+            <m:r>
+              <m:t>z</m:t>
+            </m:r>
+          </m:sub>
+        </m:sSub>
+      </m:oMath>
+    </w:p>
+    <w:p>
+      <w:pPr>
+        <w:pageBreakBefore w:val="0"/>
+        <w:spacing w:line="276" w:lineRule="auto" w:before="0" w:after="100"/>
+        <w:rPr>
+          <w:rFonts w:ascii="宋体" w:hAnsi="宋体"/>
+          <w:lang w:eastAsia="zh-CN"/>
+        </w:rPr>
+      </w:pPr>
+      <w:r>
+        <w:rPr>
+          <w:sz w:val="24"/>
+        </w:rPr>
+        <w:t>体型：</w:t>
+      </w:r>
+      <m:oMath>
+        <m:sSub>
+          <m:e>
+            <m:r>
+              <m:t>L</m:t>
+            </m:r>
+          </m:e>
+          <m:sub>
+            <m:r>
+              <m:t>3D</m:t>
+            </m:r>
+          </m:sub>
+        </m:sSub>
+        <m:sSub>
+          <m:e>
+            <m:r>
+              <m:t>+0.001L</m:t>
+            </m:r>
+          </m:e>
+          <m:sub>
+            <m:r>
+              <m:t>β</m:t>
+            </m:r>
+          </m:sub>
+        </m:sSub>
+      </m:oMath>
+    </w:p>
+    <w:p>
+      <w:pPr>
+        <w:pageBreakBefore w:val="0"/>
+        <w:spacing w:line="276" w:lineRule="auto" w:before="0" w:after="100"/>
+        <w:rPr>
+          <w:rFonts w:ascii="宋体" w:hAnsi="宋体"/>
+          <w:lang w:eastAsia="zh-CN"/>
+        </w:rPr>
+      </w:pPr>
+      <w:r>
+        <w:rPr>
+          <w:sz w:val="24"/>
+        </w:rPr>
+        <w:t>身体参数联合拟合：</w:t>
+      </w:r>
+      <m:oMath>
+        <m:sSub>
+          <m:e>
+            <m:r>
+              <m:t>L</m:t>
+            </m:r>
+          </m:e>
+          <m:sub>
+            <m:r>
+              <m:t>3D</m:t>
+            </m:r>
+          </m:sub>
+        </m:sSub>
+        <m:sSub>
+          <m:e>
+            <m:r>
+              <m:t>+0.02L</m:t>
+            </m:r>
+          </m:e>
+          <m:sub>
+            <m:r>
+              <m:t>z</m:t>
+            </m:r>
+          </m:sub>
+        </m:sSub>
+        <m:sSub>
+          <m:e>
+            <m:r>
+              <m:t>+0.001L</m:t>
+            </m:r>
+          </m:e>
+          <m:sub>
+            <m:r>
+              <m:t>β</m:t>
+            </m:r>
+          </m:sub>
+        </m:sSub>
+        <m:sSub>
+          <m:e>
+            <m:r>
+              <m:t>+0.01L</m:t>
+            </m:r>
+          </m:e>
+          <m:sub>
+            <m:r>
+              <m:t>r</m:t>
+            </m:r>
+          </m:sub>
+        </m:sSub>
+      </m:oMath>
+    </w:p>
+    <w:p>
+      <w:pPr>
+        <w:pageBreakBefore w:val="0"/>
+        <w:spacing w:line="276" w:lineRule="auto" w:before="0" w:after="100"/>
+        <w:rPr>
+          <w:rFonts w:ascii="宋体" w:hAnsi="宋体"/>
+          <w:lang w:eastAsia="zh-CN"/>
+        </w:rPr>
+      </w:pPr>
+      <w:r>
+        <w:rPr>
+          <w:sz w:val="24"/>
+        </w:rPr>
+        <w:t>手部姿态拟合：</w:t>
+      </w:r>
+      <m:oMath>
+        <m:sSub>
+          <m:e>
+            <m:r>
+              <m:t>0.1L</m:t>
+            </m:r>
+          </m:e>
+          <m:sub>
+            <m:r>
+              <m:t>MANO</m:t>
+            </m:r>
+          </m:sub>
+        </m:sSub>
+        <m:sSub>
+          <m:e>
+            <m:r>
+              <m:t>+0.001L</m:t>
+            </m:r>
+          </m:e>
+          <m:sub>
+            <m:r>
+              <m:t>PCA</m:t>
+            </m:r>
+          </m:sub>
+        </m:sSub>
+      </m:oMath>
+    </w:p>
+    <w:p>
+      <w:pPr>
+        <w:pageBreakBefore w:val="0"/>
+        <w:spacing w:line="276" w:lineRule="auto" w:before="0" w:after="100"/>
+        <w:rPr>
+          <w:rFonts w:ascii="宋体" w:hAnsi="宋体"/>
+          <w:lang w:eastAsia="zh-CN"/>
+        </w:rPr>
+      </w:pPr>
+      <w:r>
+        <w:rPr>
+          <w:sz w:val="24"/>
+        </w:rPr>
+        <w:t>手部姿态进一步拟合：</w:t>
+      </w:r>
+      <m:oMath>
+        <m:sSub>
+          <m:e>
+            <m:r>
+              <m:t>0.1L</m:t>
+            </m:r>
+          </m:e>
+          <m:sub>
+            <m:r>
+              <m:t>MANO</m:t>
+            </m:r>
+          </m:sub>
+        </m:sSub>
+        <m:sSub>
+          <m:e>
+            <m:r>
+              <m:t>+0.001L</m:t>
+            </m:r>
+          </m:e>
+          <m:sub>
+            <m:r>
+              <m:t>PCA</m:t>
+            </m:r>
+          </m:sub>
+        </m:sSub>
+      </m:oMath>
+    </w:p>
+    <w:p>
+      <w:pPr>
+        <w:spacing w:after="100"/>
+      </w:pPr>
+      <w:r>
+        <w:rPr>
+          <w:sz w:val="24"/>
+        </w:rPr>
+        <w:t>其中，</w:t>
+      </w:r>
+      <m:oMath>
+        <m:sSub>
+          <m:e>
+            <m:r>
+              <m:t>L</m:t>
+            </m:r>
+          </m:e>
+          <m:sub>
+            <m:r>
+              <m:t>MANO</m:t>
+            </m:r>
+          </m:sub>
+        </m:sSub>
+      </m:oMath>
+      <w:r>
+        <w:rPr>
+          <w:sz w:val="24"/>
+        </w:rPr>
+        <w:t>为左右手局部旋转拟合损失的均值，</w:t>
+      </w:r>
+      <m:oMath>
+        <m:sSub>
+          <m:e>
+            <m:r>
+              <m:t>L</m:t>
+            </m:r>
+          </m:e>
+          <m:sub>
+            <m:r>
+              <m:t>PCA</m:t>
+            </m:r>
+          </m:sub>
+        </m:sSub>
+      </m:oMath>
+      <w:r>
+        <w:rPr>
+          <w:sz w:val="24"/>
+        </w:rPr>
+        <w:t>为左右手PCA系数均方值之和；其余损失项见前文身体目标函数。</w:t>
+      </w:r>
+    </w:p>
+    <w:p>
+      <w:pPr>
+        <w:pageBreakBefore w:val="0"/>
+        <w:spacing w:line="276" w:lineRule="auto" w:before="0" w:after="100"/>
+        <w:rPr>
+          <w:rFonts w:ascii="宋体" w:hAnsi="宋体"/>
+          <w:lang w:eastAsia="zh-CN"/>
+        </w:rPr>
+      </w:pPr>
+      <w:r>
+        <w:rPr>
+          <w:sz w:val="24"/>
+        </w:rPr>
+        <w:t>三维拟合误差使用全部有效身体关键点。例如，体型阶段固定身体姿态、根旋转和平移，通过体型变化引起的关键点位置变化来降低误差。冻结参数的正则项在当前阶段为常数，上述目标省略这些常数项。手部阶段使用局部旋转误差与PCA正则项更新手部参数。</w:t>
+      </w:r>
+    </w:p>
+    <w:p>
+      <w:pPr>
+        <w:pageBreakBefore/>
         <w:spacing w:line="276" w:lineRule="auto"/>
         <w:rPr>
           <w:rFonts w:ascii="宋体" w:hAnsi="宋体"/>
@@ -7504,6 +8065,7 @@
     <w:p>
       <w:pPr>
         <w:pStyle w:val="21"/>
+        <w:pageBreakBefore w:val="0"/>
         <w:rPr>
           <w:rFonts w:ascii="宋体" w:eastAsia="宋体" w:hAnsi="宋体"/>
           <w:lang w:eastAsia="zh-CN"/>

</xml_diff>